<commit_message>
Actualiza Word individuales Diego al formato y extension de Reinhartd.
Co-authored-by: Cursor <cursoragent@cursor.com>
</commit_message>
<xml_diff>
--- a/fase2/Evidencias Individuales/MADRID_DIEGO_2.1_APT122_DiarioReflexionFase2.docx
+++ b/fase2/Evidencias Individuales/MADRID_DIEGO_2.1_APT122_DiarioReflexionFase2.docx
@@ -303,7 +303,15 @@
           </w:tcPr>
           <w:p>
             <w:r>
-              <w:t>Parcialmente: la Gantt v2.0 ubicaba DTE en Sprint 2; los sprints 1 y 2 se usaron en el diferenciador Capstone (PaymentGateway, proxy Webpay, QR en Celular Android). Facilitó D-PAY 2.0 en producción (operado por mí), terminal Kozen P8 Neo desde octubre y API proqa. Dificultó rutas Windows largas (mitigado con C:\p\a), Metro/adb reverse y DTE/tbl_dpay pendientes. Sprint 3 (06/10–17/10): informe S10 y cierre parcial DTE.</w:t>
+              <w:t>¿Has podido cumplir todas las actividades en los tiempos definidos? ¿Qué factores han facilitado o dificultado el desarrollo de las actividades de tu plan de trabajo?</w:t>
+              <w:br/>
+              <w:t>Parcialmente: no se cumplieron todas las actividades en las fechas de la carta Gantt v2.0.</w:t>
+              <w:br/>
+              <w:t>La Gantt ubicaba en el Sprint 1 (08/09 al 21/09) el login, la sesión y el armado de la venta, y en el Sprint 2 (22/09–05/10) el cobro y la emisión de DTE. En la práctica, los sprints 1 y 2 se usaron para el diferenciador Capstone: la capa PaymentGateway, el proxy Webpay y el cobro por QR en un Celular Android (PR #7 a #15), junto con el DAS (05) y el manual (08). El POS heredado ya permitía vender y cobrar en efectivo; mi trabajo fue desacoplar pasarelas sin romper esa ruta. Quedaron evidenciados Webpay (aprobado, rechazado y cancelación, 03/10 y 04/10), efectivo con historial local (27/09) y, el 13/10, regresión TUU/Kozen en terminal P8 Neo (capturas en 07). La emisión de DTE pasó al Sprint 3 y sigue abierta. El Sprint 3 (06/10 al 17/10) está en curso.</w:t>
+              <w:br/>
+              <w:t>Facilitaron el trabajo operar D-PAY 2.0 en producción (mandante), el código TUU reutilizable, los códigos públicos de integración de Transbank, la integración con Reinhartd Munzenmayer en el proxy, las revisiones por Pull Request y contar con terminal Kozen desde octubre.</w:t>
+              <w:br/>
+              <w:t>Dificultaron el plan las rutas Windows largas para Gradle/CMake (mitigado con copia de build C:\p\a), Metro que exige adb reverse tcp:8081 en cada sesión USB, el proxy en LAN (DEF-NET), la deriva del timeout del checkout (cerrada; oficial 300 s) y la sincronización Webpay con tbl_dpay aún sin id_mediopago oficial.</w:t>
             </w:r>
           </w:p>
         </w:tc>
@@ -406,7 +414,15 @@
           </w:tcPr>
           <w:p>
             <w:r>
-              <w:t>Celular sin TUU: perfil GENERIC_MOBILE + Webpay. TC-064: ejecutado 13/10 en Kozen con evidencia en 07. DEF-NET: documentado en manual 08 (LAN, reverse). Build: copia C:\p\a. DTE movido a Sprint 3. Publicación Git con Pablo (PR #17).</w:t>
+              <w:t>¿De qué manera has enfrentado y/o planeas enfrentar las dificultades que han afectado el desarrollo de tu Proyecto APT?</w:t>
+              <w:br/>
+              <w:t>Cada dificultad quedó con un ajuste concreto y un responsable, sin adelantar resultados que aún no existen.</w:t>
+              <w:br/>
+              <w:t>El celular genérico no es un terminal Kozen: diseñamos el perfil GENERIC_MOBILE y Webpay en la app, sin forzar TUU en hardware que no lo tiene. La regresión TUU/Kozen se ejecutó el 13/10/2026 en P8 Neo (TC-RG-01 / TC-064), con ocho capturas en 07_Plan_de_Pruebas/05_Evidencias_por_sprint/Sprint_03/capturas_20261013/, además de las 17 pruebas unitarias en verde.</w:t>
+              <w:br/>
+              <w:t>El proxy apagado o en 127.0.0.1 sin USB (DEF-NET) quedó documentado en el manual 08: IP LAN, adb reverse 8787/8081, NetInfo y timeout de fetch de 8 s. El re-test del error de conexión sin cable USB (TC-063) permanece a cargo de Reinhartd Munzenmayer en el Sprint 3.</w:t>
+              <w:br/>
+              <w:t>El timeout oficial del checkout es 300 s (DEF-DOC-01 cerrado). La emisión de DTE se movió al Sprint 3 y no se declara cerrada. Los documentos 05 y 08 ya están en Drive. Pablo Gutiérrez y yo publicamos, revisamos y actualizamos en Git (PR #17).</w:t>
             </w:r>
           </w:p>
         </w:tc>
@@ -484,7 +500,13 @@
           </w:tcPr>
           <w:p>
             <w:r>
-              <w:t>Trabajo logrado, no cerrado. Como responsable de 05 y 08 destaco DAS v1.0.2, manual en Drive, PaymentGateway en main y sesión Kozen 13/10. Para mejorar: tbl_dpay Webpay, DTE end-to-end, revisión cruzada manual/DAS en cada cambio de red.</w:t>
+              <w:t>¿Cómo evalúas tu trabajo? ¿Qué destacas y qué podrías hacer para mejorar tu trabajo?</w:t>
+              <w:br/>
+              <w:t>Trabajo como logrado, no como cerrado. Como responsable de 05 Documento de Diseño y 08 Manual Técnico de Despliegue, y de la integración PaymentGateway con la API de DTemite.</w:t>
+              <w:br/>
+              <w:t>Destaco el DAS v1.0.2 (01/10) con vistas 4+1 y ER lógico, el manual 08 cargado en Drive (proxy Webpay, Metro, emulador, Kozen armeabi-v7a, entorno QA), la factory y perfiles de dispositivo en main, la sesión Kozen del 13/10 y no haber regresado venta en efectivo ni el cobro TUU de D-PAY 2.0 en producción.</w:t>
+              <w:br/>
+              <w:t>Para mejorar: cerrar DTE (HU-07) con folio SII, registrar Webpay en tbl_dpay cuando backend defina id_mediopago, mantener Word 05/08 fechado con Git, pedir revisión cruzada del manual cuando cambie la red o el timeout, y terminar la publicación del PR #17.</w:t>
             </w:r>
           </w:p>
         </w:tc>
@@ -566,7 +588,13 @@
           </w:tcPr>
           <w:p>
             <w:r>
-              <w:t>Inquietud: el MVP Webpay/Kozen está evidenciado, pero el POS completo (DTE folio SII) no. Pregunta al docente: confirmar si el 80% del informe S10 aplica al paquete Capstone (05/08 + pasarela) o al POS S15 completo.</w:t>
+              <w:t>¿Qué inquietudes te quedan sobre cómo proceder? ¿Qué pregunta te gustaría hacerle a tu docente o a tus pares?</w:t>
+              <w:br/>
+              <w:t>Inquietudes en el procedimiento. El proyecto puede cobrar con Webpay en un celular genérico y con TUU en Kozen, pero no es aún un POS completo: faltan DTE con folio SII y el registro backend de pagos Webpay.</w:t>
+              <w:br/>
+              <w:t>A mis colegas en el trabajo;</w:t>
+              <w:br/>
+              <w:t>¿Cómo fue el trabajo que realizamos en conjunto, la experiencia y cooperación, y si logramos alguna sinergia?, para ustedes que ya están inmersos en el área de desarrollo, ¿qué tan cercano fue esta experiencia con la vida real laboral?, ¿qué consejos, tips y ayuda me pueden dar en base a su experiencia?, ¿cómo se ve el desarrollo y el uso de la IA, así como la utilizamos y aplicamos en este proyecto?.</w:t>
             </w:r>
           </w:p>
         </w:tc>
@@ -656,7 +684,17 @@
           </w:tcPr>
           <w:p>
             <w:r>
-              <w:t>Roles estables: yo — 05/08 e integración; Pablo — 03/04 y Git; Reinhartd — 06/07. Pendientes: yo — DTE y tbl_dpay; Pablo — PR #17; Reinhartd — TC-063 sin USB.</w:t>
+              <w:t>¿Consideran que las actividades deben ser redistribuidas entre los miembros del grupo? ¿Hay nuevas actividades que deban ser asignadas a algún miembro del grupo?</w:t>
+              <w:br/>
+              <w:t>Los roles de fondo se mantienen: Diego Madrid, arquitectura e integración Webpay (DAS y manual de despliegue); Pablo Gutiérrez, Scrum Master, Sprint Backlog y Definition of Done, y publicación en Git; Reinhartd Munzenmayer, QA, HU-06, retrospectivas y plan de pruebas. Redistribuir esas carteras a mitad del Sprint 3 rompería la trazabilidad de 05/08 y de 06/07.</w:t>
+              <w:br/>
+              <w:t>Existen actividades pendientes las redistribuimos, y según el avance y necesidad podemos replantearnos los roles, los cuales nos definen, pero no son estáticos.</w:t>
+              <w:br/>
+              <w:t>Diego: avanzar DTE / tbl_dpay, mantener DAS y manual 08 alineados a main, soporte Metro/Kozen en demos.</w:t>
+              <w:br/>
+              <w:t>Pablo: convocar Review y Retro S03, mover Trello a mano (D-02) y publicar, revisar y actualizar el PR #17.</w:t>
+              <w:br/>
+              <w:t>Reinhartd: re-test de TC-063 sin USB y completar las muestras de login y de apertura Webpay que siguen parciales.</w:t>
             </w:r>
           </w:p>
         </w:tc>
@@ -754,7 +792,13 @@
           </w:tcPr>
           <w:p>
             <w:r>
-              <w:t>Grupo sólido en producto y PRs. Positivo: actas firmadas, capturas Kozen 13/10, D-PAY 2.0 como línea base. Mejorar: cerrar PR #17, Retro S03 y Trello alineado al backlog.</w:t>
+              <w:t>¿Cómo evalúan el trabajo en grupo? ¿Qué aspectos positivos destacan? ¿Qué aspectos podrían mejorar?</w:t>
+              <w:br/>
+              <w:t>Desde mi punto de vista personal, el trabajo en grupo es sólido en el producto y en las ceremonias, pero debemos manejar e igual las publicaciones que son los puntos medibles.</w:t>
+              <w:br/>
+              <w:t>Lo positivo: las actas S01 y S02 están firmadas por los tres; cada incremento entra por Pull Request; D-PAY 2.0 en producción sigue siendo la línea base; las capturas Kozen del 13/10 cierran la narrativa de regresión TUU; los bloqueos se informan como bloqueos (DTE, tbl_dpay).</w:t>
+              <w:br/>
+              <w:t>Lo que podemos mejorar: 05 y 08 ya están en Drive pero deben quedar publicados en Git con PR #17; Trello no está automatizado; la Retro S03 no se ha realizado. El ambiente de trabajo es colaborativo.</w:t>
             </w:r>
           </w:p>
         </w:tc>

</xml_diff>